<commit_message>
purge: remove ALL Bihar/Patna refs — Bengaluru/Karnataka everywhere; delete Bihar-edition builders+docx
</commit_message>
<xml_diff>
--- a/outputs/goc/TRINITY_Appendix_B_Government_Evaluation_Bengaluru.docx
+++ b/outputs/goc/TRINITY_Appendix_B_Government_Evaluation_Bengaluru.docx
@@ -874,7 +874,7 @@
         <w:pStyle w:val="ListBullet"/>
       </w:pPr>
       <w:r>
-        <w:t>Rural and ESG impact — Bihar pilot + offline/Indic access + clean-energy linkage</w:t>
+        <w:t>Rural and ESG impact — rural pilot + offline/Indic access + clean-energy linkage</w:t>
       </w:r>
     </w:p>
     <w:p>
@@ -1103,7 +1103,7 @@
           </w:tcPr>
           <w:p>
             <w:r>
-              <w:t>Bihar pilot defined</w:t>
+              <w:t>Rural pilot defined</w:t>
             </w:r>
           </w:p>
         </w:tc>

</xml_diff>